<commit_message>
added makefiles and dockerfiles
</commit_message>
<xml_diff>
--- a/Shemach/Волошкевич 7 лаба/Волошкевич 7 лаба.docx
+++ b/Shemach/Волошкевич 7 лаба/Волошкевич 7 лаба.docx
@@ -403,25 +403,8 @@
         </w:rPr>
       </w:pPr>
       <w:r>
-        <w:rPr>
-          <w:rFonts w:eastAsia="Times New Roman" w:cs="Times New Roman"/>
-          <w:b w:val="false"/>
-          <w:i w:val="false"/>
-          <w:caps w:val="false"/>
-          <w:smallCaps w:val="false"/>
-          <w:strike w:val="false"/>
-          <w:dstrike w:val="false"/>
-          <w:color w:val="000000"/>
-          <w:position w:val="0"/>
-          <w:sz w:val="28"/>
-          <w:sz w:val="28"/>
-          <w:szCs w:val="28"/>
-          <w:u w:val="none"/>
-          <w:shd w:fill="auto" w:val="clear"/>
-          <w:vertAlign w:val="baseline"/>
-        </w:rPr>
         <w:drawing>
-          <wp:anchor behindDoc="0" distT="0" distB="0" distL="0" distR="0" simplePos="0" locked="0" layoutInCell="0" allowOverlap="1" relativeHeight="39">
+          <wp:anchor behindDoc="0" distT="0" distB="0" distL="0" distR="0" simplePos="0" locked="0" layoutInCell="0" allowOverlap="1" relativeHeight="11">
             <wp:simplePos x="0" y="0"/>
             <wp:positionH relativeFrom="column">
               <wp:posOffset>2685415</wp:posOffset>
@@ -5117,11 +5100,11 @@
       </w:tblPr>
       <w:tblGrid>
         <w:gridCol w:w="870"/>
-        <w:gridCol w:w="1177"/>
-        <w:gridCol w:w="2343"/>
-        <w:gridCol w:w="2128"/>
+        <w:gridCol w:w="1175"/>
+        <w:gridCol w:w="2345"/>
+        <w:gridCol w:w="2130"/>
         <w:gridCol w:w="1569"/>
-        <w:gridCol w:w="1824"/>
+        <w:gridCol w:w="1822"/>
       </w:tblGrid>
       <w:tr>
         <w:trPr/>
@@ -5188,7 +5171,7 @@
         </w:tc>
         <w:tc>
           <w:tcPr>
-            <w:tcW w:w="1177" w:type="dxa"/>
+            <w:tcW w:w="1175" w:type="dxa"/>
             <w:tcBorders>
               <w:top w:val="single" w:sz="4" w:space="0" w:color="000000"/>
               <w:left w:val="single" w:sz="4" w:space="0" w:color="000000"/>
@@ -5249,7 +5232,7 @@
         </w:tc>
         <w:tc>
           <w:tcPr>
-            <w:tcW w:w="2343" w:type="dxa"/>
+            <w:tcW w:w="2345" w:type="dxa"/>
             <w:tcBorders>
               <w:top w:val="single" w:sz="4" w:space="0" w:color="000000"/>
               <w:left w:val="single" w:sz="4" w:space="0" w:color="000000"/>
@@ -5380,7 +5363,7 @@
         </w:tc>
         <w:tc>
           <w:tcPr>
-            <w:tcW w:w="2128" w:type="dxa"/>
+            <w:tcW w:w="2130" w:type="dxa"/>
             <w:tcBorders>
               <w:top w:val="single" w:sz="4" w:space="0" w:color="000000"/>
               <w:left w:val="single" w:sz="4" w:space="0" w:color="000000"/>
@@ -5619,7 +5602,7 @@
         </w:tc>
         <w:tc>
           <w:tcPr>
-            <w:tcW w:w="1824" w:type="dxa"/>
+            <w:tcW w:w="1822" w:type="dxa"/>
             <w:tcBorders>
               <w:top w:val="single" w:sz="4" w:space="0" w:color="000000"/>
               <w:left w:val="single" w:sz="4" w:space="0" w:color="000000"/>
@@ -5821,7 +5804,7 @@
         </w:tc>
         <w:tc>
           <w:tcPr>
-            <w:tcW w:w="1177" w:type="dxa"/>
+            <w:tcW w:w="1175" w:type="dxa"/>
             <w:tcBorders>
               <w:top w:val="single" w:sz="4" w:space="0" w:color="000000"/>
               <w:left w:val="single" w:sz="4" w:space="0" w:color="000000"/>
@@ -5882,7 +5865,7 @@
         </w:tc>
         <w:tc>
           <w:tcPr>
-            <w:tcW w:w="2343" w:type="dxa"/>
+            <w:tcW w:w="2345" w:type="dxa"/>
             <w:tcBorders>
               <w:top w:val="single" w:sz="4" w:space="0" w:color="000000"/>
               <w:left w:val="single" w:sz="4" w:space="0" w:color="000000"/>
@@ -5943,7 +5926,7 @@
         </w:tc>
         <w:tc>
           <w:tcPr>
-            <w:tcW w:w="2128" w:type="dxa"/>
+            <w:tcW w:w="2130" w:type="dxa"/>
             <w:tcBorders>
               <w:top w:val="single" w:sz="4" w:space="0" w:color="000000"/>
               <w:left w:val="single" w:sz="4" w:space="0" w:color="000000"/>
@@ -6065,7 +6048,7 @@
         </w:tc>
         <w:tc>
           <w:tcPr>
-            <w:tcW w:w="1824" w:type="dxa"/>
+            <w:tcW w:w="1822" w:type="dxa"/>
             <w:tcBorders>
               <w:top w:val="single" w:sz="4" w:space="0" w:color="000000"/>
               <w:left w:val="single" w:sz="4" w:space="0" w:color="000000"/>
@@ -6190,7 +6173,7 @@
         </w:tc>
         <w:tc>
           <w:tcPr>
-            <w:tcW w:w="1177" w:type="dxa"/>
+            <w:tcW w:w="1175" w:type="dxa"/>
             <w:tcBorders>
               <w:top w:val="single" w:sz="4" w:space="0" w:color="000000"/>
               <w:left w:val="single" w:sz="4" w:space="0" w:color="000000"/>
@@ -6251,7 +6234,7 @@
         </w:tc>
         <w:tc>
           <w:tcPr>
-            <w:tcW w:w="2343" w:type="dxa"/>
+            <w:tcW w:w="2345" w:type="dxa"/>
             <w:tcBorders>
               <w:top w:val="single" w:sz="4" w:space="0" w:color="000000"/>
               <w:left w:val="single" w:sz="4" w:space="0" w:color="000000"/>
@@ -6312,7 +6295,7 @@
         </w:tc>
         <w:tc>
           <w:tcPr>
-            <w:tcW w:w="2128" w:type="dxa"/>
+            <w:tcW w:w="2130" w:type="dxa"/>
             <w:tcBorders>
               <w:top w:val="single" w:sz="4" w:space="0" w:color="000000"/>
               <w:left w:val="single" w:sz="4" w:space="0" w:color="000000"/>
@@ -6434,7 +6417,7 @@
         </w:tc>
         <w:tc>
           <w:tcPr>
-            <w:tcW w:w="1824" w:type="dxa"/>
+            <w:tcW w:w="1822" w:type="dxa"/>
             <w:tcBorders>
               <w:top w:val="single" w:sz="4" w:space="0" w:color="000000"/>
               <w:left w:val="single" w:sz="4" w:space="0" w:color="000000"/>
@@ -6559,7 +6542,7 @@
         </w:tc>
         <w:tc>
           <w:tcPr>
-            <w:tcW w:w="1177" w:type="dxa"/>
+            <w:tcW w:w="1175" w:type="dxa"/>
             <w:tcBorders>
               <w:top w:val="single" w:sz="4" w:space="0" w:color="000000"/>
               <w:left w:val="single" w:sz="4" w:space="0" w:color="000000"/>
@@ -6620,7 +6603,7 @@
         </w:tc>
         <w:tc>
           <w:tcPr>
-            <w:tcW w:w="2343" w:type="dxa"/>
+            <w:tcW w:w="2345" w:type="dxa"/>
             <w:tcBorders>
               <w:top w:val="single" w:sz="4" w:space="0" w:color="000000"/>
               <w:left w:val="single" w:sz="4" w:space="0" w:color="000000"/>
@@ -6681,7 +6664,7 @@
         </w:tc>
         <w:tc>
           <w:tcPr>
-            <w:tcW w:w="2128" w:type="dxa"/>
+            <w:tcW w:w="2130" w:type="dxa"/>
             <w:tcBorders>
               <w:top w:val="single" w:sz="4" w:space="0" w:color="000000"/>
               <w:left w:val="single" w:sz="4" w:space="0" w:color="000000"/>
@@ -6803,7 +6786,7 @@
         </w:tc>
         <w:tc>
           <w:tcPr>
-            <w:tcW w:w="1824" w:type="dxa"/>
+            <w:tcW w:w="1822" w:type="dxa"/>
             <w:tcBorders>
               <w:top w:val="single" w:sz="4" w:space="0" w:color="000000"/>
               <w:left w:val="single" w:sz="4" w:space="0" w:color="000000"/>
@@ -6928,7 +6911,7 @@
         </w:tc>
         <w:tc>
           <w:tcPr>
-            <w:tcW w:w="1177" w:type="dxa"/>
+            <w:tcW w:w="1175" w:type="dxa"/>
             <w:tcBorders>
               <w:top w:val="single" w:sz="4" w:space="0" w:color="000000"/>
               <w:left w:val="single" w:sz="4" w:space="0" w:color="000000"/>
@@ -6989,7 +6972,7 @@
         </w:tc>
         <w:tc>
           <w:tcPr>
-            <w:tcW w:w="2343" w:type="dxa"/>
+            <w:tcW w:w="2345" w:type="dxa"/>
             <w:tcBorders>
               <w:top w:val="single" w:sz="4" w:space="0" w:color="000000"/>
               <w:left w:val="single" w:sz="4" w:space="0" w:color="000000"/>
@@ -7050,7 +7033,7 @@
         </w:tc>
         <w:tc>
           <w:tcPr>
-            <w:tcW w:w="2128" w:type="dxa"/>
+            <w:tcW w:w="2130" w:type="dxa"/>
             <w:tcBorders>
               <w:top w:val="single" w:sz="4" w:space="0" w:color="000000"/>
               <w:left w:val="single" w:sz="4" w:space="0" w:color="000000"/>
@@ -7172,7 +7155,7 @@
         </w:tc>
         <w:tc>
           <w:tcPr>
-            <w:tcW w:w="1824" w:type="dxa"/>
+            <w:tcW w:w="1822" w:type="dxa"/>
             <w:tcBorders>
               <w:top w:val="single" w:sz="4" w:space="0" w:color="000000"/>
               <w:left w:val="single" w:sz="4" w:space="0" w:color="000000"/>
@@ -7297,7 +7280,7 @@
         </w:tc>
         <w:tc>
           <w:tcPr>
-            <w:tcW w:w="1177" w:type="dxa"/>
+            <w:tcW w:w="1175" w:type="dxa"/>
             <w:tcBorders>
               <w:top w:val="single" w:sz="4" w:space="0" w:color="000000"/>
               <w:left w:val="single" w:sz="4" w:space="0" w:color="000000"/>
@@ -7358,7 +7341,7 @@
         </w:tc>
         <w:tc>
           <w:tcPr>
-            <w:tcW w:w="2343" w:type="dxa"/>
+            <w:tcW w:w="2345" w:type="dxa"/>
             <w:tcBorders>
               <w:top w:val="single" w:sz="4" w:space="0" w:color="000000"/>
               <w:left w:val="single" w:sz="4" w:space="0" w:color="000000"/>
@@ -7419,7 +7402,7 @@
         </w:tc>
         <w:tc>
           <w:tcPr>
-            <w:tcW w:w="2128" w:type="dxa"/>
+            <w:tcW w:w="2130" w:type="dxa"/>
             <w:tcBorders>
               <w:top w:val="single" w:sz="4" w:space="0" w:color="000000"/>
               <w:left w:val="single" w:sz="4" w:space="0" w:color="000000"/>
@@ -7541,7 +7524,7 @@
         </w:tc>
         <w:tc>
           <w:tcPr>
-            <w:tcW w:w="1824" w:type="dxa"/>
+            <w:tcW w:w="1822" w:type="dxa"/>
             <w:tcBorders>
               <w:top w:val="single" w:sz="4" w:space="0" w:color="000000"/>
               <w:left w:val="single" w:sz="4" w:space="0" w:color="000000"/>
@@ -7666,7 +7649,7 @@
         </w:tc>
         <w:tc>
           <w:tcPr>
-            <w:tcW w:w="1177" w:type="dxa"/>
+            <w:tcW w:w="1175" w:type="dxa"/>
             <w:tcBorders>
               <w:top w:val="single" w:sz="4" w:space="0" w:color="000000"/>
               <w:left w:val="single" w:sz="4" w:space="0" w:color="000000"/>
@@ -7727,7 +7710,7 @@
         </w:tc>
         <w:tc>
           <w:tcPr>
-            <w:tcW w:w="2343" w:type="dxa"/>
+            <w:tcW w:w="2345" w:type="dxa"/>
             <w:tcBorders>
               <w:top w:val="single" w:sz="4" w:space="0" w:color="000000"/>
               <w:left w:val="single" w:sz="4" w:space="0" w:color="000000"/>
@@ -7788,7 +7771,7 @@
         </w:tc>
         <w:tc>
           <w:tcPr>
-            <w:tcW w:w="2128" w:type="dxa"/>
+            <w:tcW w:w="2130" w:type="dxa"/>
             <w:tcBorders>
               <w:top w:val="single" w:sz="4" w:space="0" w:color="000000"/>
               <w:left w:val="single" w:sz="4" w:space="0" w:color="000000"/>
@@ -7910,7 +7893,7 @@
         </w:tc>
         <w:tc>
           <w:tcPr>
-            <w:tcW w:w="1824" w:type="dxa"/>
+            <w:tcW w:w="1822" w:type="dxa"/>
             <w:tcBorders>
               <w:top w:val="single" w:sz="4" w:space="0" w:color="000000"/>
               <w:left w:val="single" w:sz="4" w:space="0" w:color="000000"/>
@@ -8035,7 +8018,7 @@
         </w:tc>
         <w:tc>
           <w:tcPr>
-            <w:tcW w:w="1177" w:type="dxa"/>
+            <w:tcW w:w="1175" w:type="dxa"/>
             <w:tcBorders>
               <w:top w:val="single" w:sz="4" w:space="0" w:color="000000"/>
               <w:left w:val="single" w:sz="4" w:space="0" w:color="000000"/>
@@ -8096,7 +8079,7 @@
         </w:tc>
         <w:tc>
           <w:tcPr>
-            <w:tcW w:w="2343" w:type="dxa"/>
+            <w:tcW w:w="2345" w:type="dxa"/>
             <w:tcBorders>
               <w:top w:val="single" w:sz="4" w:space="0" w:color="000000"/>
               <w:left w:val="single" w:sz="4" w:space="0" w:color="000000"/>
@@ -8157,7 +8140,7 @@
         </w:tc>
         <w:tc>
           <w:tcPr>
-            <w:tcW w:w="2128" w:type="dxa"/>
+            <w:tcW w:w="2130" w:type="dxa"/>
             <w:tcBorders>
               <w:top w:val="single" w:sz="4" w:space="0" w:color="000000"/>
               <w:left w:val="single" w:sz="4" w:space="0" w:color="000000"/>
@@ -8279,7 +8262,7 @@
         </w:tc>
         <w:tc>
           <w:tcPr>
-            <w:tcW w:w="1824" w:type="dxa"/>
+            <w:tcW w:w="1822" w:type="dxa"/>
             <w:tcBorders>
               <w:top w:val="single" w:sz="4" w:space="0" w:color="000000"/>
               <w:left w:val="single" w:sz="4" w:space="0" w:color="000000"/>
@@ -8404,7 +8387,7 @@
         </w:tc>
         <w:tc>
           <w:tcPr>
-            <w:tcW w:w="1177" w:type="dxa"/>
+            <w:tcW w:w="1175" w:type="dxa"/>
             <w:tcBorders>
               <w:top w:val="single" w:sz="4" w:space="0" w:color="000000"/>
               <w:left w:val="single" w:sz="4" w:space="0" w:color="000000"/>
@@ -8465,7 +8448,7 @@
         </w:tc>
         <w:tc>
           <w:tcPr>
-            <w:tcW w:w="2343" w:type="dxa"/>
+            <w:tcW w:w="2345" w:type="dxa"/>
             <w:tcBorders>
               <w:top w:val="single" w:sz="4" w:space="0" w:color="000000"/>
               <w:left w:val="single" w:sz="4" w:space="0" w:color="000000"/>
@@ -8526,7 +8509,7 @@
         </w:tc>
         <w:tc>
           <w:tcPr>
-            <w:tcW w:w="2128" w:type="dxa"/>
+            <w:tcW w:w="2130" w:type="dxa"/>
             <w:tcBorders>
               <w:top w:val="single" w:sz="4" w:space="0" w:color="000000"/>
               <w:left w:val="single" w:sz="4" w:space="0" w:color="000000"/>
@@ -8648,7 +8631,7 @@
         </w:tc>
         <w:tc>
           <w:tcPr>
-            <w:tcW w:w="1824" w:type="dxa"/>
+            <w:tcW w:w="1822" w:type="dxa"/>
             <w:tcBorders>
               <w:top w:val="single" w:sz="4" w:space="0" w:color="000000"/>
               <w:left w:val="single" w:sz="4" w:space="0" w:color="000000"/>
@@ -8773,7 +8756,7 @@
         </w:tc>
         <w:tc>
           <w:tcPr>
-            <w:tcW w:w="1177" w:type="dxa"/>
+            <w:tcW w:w="1175" w:type="dxa"/>
             <w:tcBorders>
               <w:top w:val="single" w:sz="4" w:space="0" w:color="000000"/>
               <w:left w:val="single" w:sz="4" w:space="0" w:color="000000"/>
@@ -8834,7 +8817,7 @@
         </w:tc>
         <w:tc>
           <w:tcPr>
-            <w:tcW w:w="2343" w:type="dxa"/>
+            <w:tcW w:w="2345" w:type="dxa"/>
             <w:tcBorders>
               <w:top w:val="single" w:sz="4" w:space="0" w:color="000000"/>
               <w:left w:val="single" w:sz="4" w:space="0" w:color="000000"/>
@@ -8895,7 +8878,7 @@
         </w:tc>
         <w:tc>
           <w:tcPr>
-            <w:tcW w:w="2128" w:type="dxa"/>
+            <w:tcW w:w="2130" w:type="dxa"/>
             <w:tcBorders>
               <w:top w:val="single" w:sz="4" w:space="0" w:color="000000"/>
               <w:left w:val="single" w:sz="4" w:space="0" w:color="000000"/>
@@ -9017,7 +9000,7 @@
         </w:tc>
         <w:tc>
           <w:tcPr>
-            <w:tcW w:w="1824" w:type="dxa"/>
+            <w:tcW w:w="1822" w:type="dxa"/>
             <w:tcBorders>
               <w:top w:val="single" w:sz="4" w:space="0" w:color="000000"/>
               <w:left w:val="single" w:sz="4" w:space="0" w:color="000000"/>
@@ -9142,7 +9125,7 @@
         </w:tc>
         <w:tc>
           <w:tcPr>
-            <w:tcW w:w="1177" w:type="dxa"/>
+            <w:tcW w:w="1175" w:type="dxa"/>
             <w:tcBorders>
               <w:top w:val="single" w:sz="4" w:space="0" w:color="000000"/>
               <w:left w:val="single" w:sz="4" w:space="0" w:color="000000"/>
@@ -9203,7 +9186,7 @@
         </w:tc>
         <w:tc>
           <w:tcPr>
-            <w:tcW w:w="2343" w:type="dxa"/>
+            <w:tcW w:w="2345" w:type="dxa"/>
             <w:tcBorders>
               <w:top w:val="single" w:sz="4" w:space="0" w:color="000000"/>
               <w:left w:val="single" w:sz="4" w:space="0" w:color="000000"/>
@@ -9264,7 +9247,7 @@
         </w:tc>
         <w:tc>
           <w:tcPr>
-            <w:tcW w:w="2128" w:type="dxa"/>
+            <w:tcW w:w="2130" w:type="dxa"/>
             <w:tcBorders>
               <w:top w:val="single" w:sz="4" w:space="0" w:color="000000"/>
               <w:left w:val="single" w:sz="4" w:space="0" w:color="000000"/>
@@ -9386,7 +9369,7 @@
         </w:tc>
         <w:tc>
           <w:tcPr>
-            <w:tcW w:w="1824" w:type="dxa"/>
+            <w:tcW w:w="1822" w:type="dxa"/>
             <w:tcBorders>
               <w:top w:val="single" w:sz="4" w:space="0" w:color="000000"/>
               <w:left w:val="single" w:sz="4" w:space="0" w:color="000000"/>
@@ -9511,7 +9494,7 @@
         </w:tc>
         <w:tc>
           <w:tcPr>
-            <w:tcW w:w="1177" w:type="dxa"/>
+            <w:tcW w:w="1175" w:type="dxa"/>
             <w:tcBorders>
               <w:top w:val="single" w:sz="4" w:space="0" w:color="000000"/>
               <w:left w:val="single" w:sz="4" w:space="0" w:color="000000"/>
@@ -9572,7 +9555,7 @@
         </w:tc>
         <w:tc>
           <w:tcPr>
-            <w:tcW w:w="2343" w:type="dxa"/>
+            <w:tcW w:w="2345" w:type="dxa"/>
             <w:tcBorders>
               <w:top w:val="single" w:sz="4" w:space="0" w:color="000000"/>
               <w:left w:val="single" w:sz="4" w:space="0" w:color="000000"/>
@@ -9633,7 +9616,7 @@
         </w:tc>
         <w:tc>
           <w:tcPr>
-            <w:tcW w:w="2128" w:type="dxa"/>
+            <w:tcW w:w="2130" w:type="dxa"/>
             <w:tcBorders>
               <w:top w:val="single" w:sz="4" w:space="0" w:color="000000"/>
               <w:left w:val="single" w:sz="4" w:space="0" w:color="000000"/>
@@ -9755,7 +9738,7 @@
         </w:tc>
         <w:tc>
           <w:tcPr>
-            <w:tcW w:w="1824" w:type="dxa"/>
+            <w:tcW w:w="1822" w:type="dxa"/>
             <w:tcBorders>
               <w:top w:val="single" w:sz="4" w:space="0" w:color="000000"/>
               <w:left w:val="single" w:sz="4" w:space="0" w:color="000000"/>
@@ -9880,7 +9863,7 @@
         </w:tc>
         <w:tc>
           <w:tcPr>
-            <w:tcW w:w="1177" w:type="dxa"/>
+            <w:tcW w:w="1175" w:type="dxa"/>
             <w:tcBorders>
               <w:top w:val="single" w:sz="4" w:space="0" w:color="000000"/>
               <w:left w:val="single" w:sz="4" w:space="0" w:color="000000"/>
@@ -9941,7 +9924,7 @@
         </w:tc>
         <w:tc>
           <w:tcPr>
-            <w:tcW w:w="2343" w:type="dxa"/>
+            <w:tcW w:w="2345" w:type="dxa"/>
             <w:tcBorders>
               <w:top w:val="single" w:sz="4" w:space="0" w:color="000000"/>
               <w:left w:val="single" w:sz="4" w:space="0" w:color="000000"/>
@@ -10002,7 +9985,7 @@
         </w:tc>
         <w:tc>
           <w:tcPr>
-            <w:tcW w:w="2128" w:type="dxa"/>
+            <w:tcW w:w="2130" w:type="dxa"/>
             <w:tcBorders>
               <w:top w:val="single" w:sz="4" w:space="0" w:color="000000"/>
               <w:left w:val="single" w:sz="4" w:space="0" w:color="000000"/>
@@ -10124,7 +10107,7 @@
         </w:tc>
         <w:tc>
           <w:tcPr>
-            <w:tcW w:w="1824" w:type="dxa"/>
+            <w:tcW w:w="1822" w:type="dxa"/>
             <w:tcBorders>
               <w:top w:val="single" w:sz="4" w:space="0" w:color="000000"/>
               <w:left w:val="single" w:sz="4" w:space="0" w:color="000000"/>
@@ -10249,7 +10232,7 @@
         </w:tc>
         <w:tc>
           <w:tcPr>
-            <w:tcW w:w="1177" w:type="dxa"/>
+            <w:tcW w:w="1175" w:type="dxa"/>
             <w:tcBorders>
               <w:top w:val="single" w:sz="4" w:space="0" w:color="000000"/>
               <w:left w:val="single" w:sz="4" w:space="0" w:color="000000"/>
@@ -10310,7 +10293,7 @@
         </w:tc>
         <w:tc>
           <w:tcPr>
-            <w:tcW w:w="2343" w:type="dxa"/>
+            <w:tcW w:w="2345" w:type="dxa"/>
             <w:tcBorders>
               <w:top w:val="single" w:sz="4" w:space="0" w:color="000000"/>
               <w:left w:val="single" w:sz="4" w:space="0" w:color="000000"/>
@@ -10371,7 +10354,7 @@
         </w:tc>
         <w:tc>
           <w:tcPr>
-            <w:tcW w:w="2128" w:type="dxa"/>
+            <w:tcW w:w="2130" w:type="dxa"/>
             <w:tcBorders>
               <w:top w:val="single" w:sz="4" w:space="0" w:color="000000"/>
               <w:left w:val="single" w:sz="4" w:space="0" w:color="000000"/>
@@ -10493,7 +10476,7 @@
         </w:tc>
         <w:tc>
           <w:tcPr>
-            <w:tcW w:w="1824" w:type="dxa"/>
+            <w:tcW w:w="1822" w:type="dxa"/>
             <w:tcBorders>
               <w:top w:val="single" w:sz="4" w:space="0" w:color="000000"/>
               <w:left w:val="single" w:sz="4" w:space="0" w:color="000000"/>
@@ -10764,11 +10747,11 @@
       </w:tblPr>
       <w:tblGrid>
         <w:gridCol w:w="870"/>
-        <w:gridCol w:w="1177"/>
-        <w:gridCol w:w="2343"/>
-        <w:gridCol w:w="2128"/>
+        <w:gridCol w:w="1175"/>
+        <w:gridCol w:w="2345"/>
+        <w:gridCol w:w="2130"/>
         <w:gridCol w:w="1569"/>
-        <w:gridCol w:w="1824"/>
+        <w:gridCol w:w="1822"/>
       </w:tblGrid>
       <w:tr>
         <w:trPr/>
@@ -10835,7 +10818,7 @@
         </w:tc>
         <w:tc>
           <w:tcPr>
-            <w:tcW w:w="1177" w:type="dxa"/>
+            <w:tcW w:w="1175" w:type="dxa"/>
             <w:tcBorders>
               <w:top w:val="single" w:sz="4" w:space="0" w:color="000000"/>
               <w:left w:val="single" w:sz="4" w:space="0" w:color="000000"/>
@@ -10896,7 +10879,7 @@
         </w:tc>
         <w:tc>
           <w:tcPr>
-            <w:tcW w:w="2343" w:type="dxa"/>
+            <w:tcW w:w="2345" w:type="dxa"/>
             <w:tcBorders>
               <w:top w:val="single" w:sz="4" w:space="0" w:color="000000"/>
               <w:left w:val="single" w:sz="4" w:space="0" w:color="000000"/>
@@ -11103,7 +11086,7 @@
         </w:tc>
         <w:tc>
           <w:tcPr>
-            <w:tcW w:w="2128" w:type="dxa"/>
+            <w:tcW w:w="2130" w:type="dxa"/>
             <w:tcBorders>
               <w:top w:val="single" w:sz="4" w:space="0" w:color="000000"/>
               <w:left w:val="single" w:sz="4" w:space="0" w:color="000000"/>
@@ -11412,7 +11395,7 @@
         </w:tc>
         <w:tc>
           <w:tcPr>
-            <w:tcW w:w="1824" w:type="dxa"/>
+            <w:tcW w:w="1822" w:type="dxa"/>
             <w:tcBorders>
               <w:top w:val="single" w:sz="4" w:space="0" w:color="000000"/>
               <w:left w:val="single" w:sz="4" w:space="0" w:color="000000"/>
@@ -11584,7 +11567,7 @@
         </w:tc>
         <w:tc>
           <w:tcPr>
-            <w:tcW w:w="1177" w:type="dxa"/>
+            <w:tcW w:w="1175" w:type="dxa"/>
             <w:tcBorders>
               <w:top w:val="single" w:sz="4" w:space="0" w:color="000000"/>
               <w:left w:val="single" w:sz="4" w:space="0" w:color="000000"/>
@@ -11645,7 +11628,7 @@
         </w:tc>
         <w:tc>
           <w:tcPr>
-            <w:tcW w:w="2343" w:type="dxa"/>
+            <w:tcW w:w="2345" w:type="dxa"/>
             <w:tcBorders>
               <w:top w:val="single" w:sz="4" w:space="0" w:color="000000"/>
               <w:left w:val="single" w:sz="4" w:space="0" w:color="000000"/>
@@ -11706,7 +11689,7 @@
         </w:tc>
         <w:tc>
           <w:tcPr>
-            <w:tcW w:w="2128" w:type="dxa"/>
+            <w:tcW w:w="2130" w:type="dxa"/>
             <w:tcBorders>
               <w:top w:val="single" w:sz="4" w:space="0" w:color="000000"/>
               <w:left w:val="single" w:sz="4" w:space="0" w:color="000000"/>
@@ -11828,7 +11811,7 @@
         </w:tc>
         <w:tc>
           <w:tcPr>
-            <w:tcW w:w="1824" w:type="dxa"/>
+            <w:tcW w:w="1822" w:type="dxa"/>
             <w:tcBorders>
               <w:top w:val="single" w:sz="4" w:space="0" w:color="000000"/>
               <w:left w:val="single" w:sz="4" w:space="0" w:color="000000"/>
@@ -11953,7 +11936,7 @@
         </w:tc>
         <w:tc>
           <w:tcPr>
-            <w:tcW w:w="1177" w:type="dxa"/>
+            <w:tcW w:w="1175" w:type="dxa"/>
             <w:tcBorders>
               <w:top w:val="single" w:sz="4" w:space="0" w:color="000000"/>
               <w:left w:val="single" w:sz="4" w:space="0" w:color="000000"/>
@@ -12014,7 +11997,7 @@
         </w:tc>
         <w:tc>
           <w:tcPr>
-            <w:tcW w:w="2343" w:type="dxa"/>
+            <w:tcW w:w="2345" w:type="dxa"/>
             <w:tcBorders>
               <w:top w:val="single" w:sz="4" w:space="0" w:color="000000"/>
               <w:left w:val="single" w:sz="4" w:space="0" w:color="000000"/>
@@ -12075,7 +12058,7 @@
         </w:tc>
         <w:tc>
           <w:tcPr>
-            <w:tcW w:w="2128" w:type="dxa"/>
+            <w:tcW w:w="2130" w:type="dxa"/>
             <w:tcBorders>
               <w:top w:val="single" w:sz="4" w:space="0" w:color="000000"/>
               <w:left w:val="single" w:sz="4" w:space="0" w:color="000000"/>
@@ -12197,7 +12180,7 @@
         </w:tc>
         <w:tc>
           <w:tcPr>
-            <w:tcW w:w="1824" w:type="dxa"/>
+            <w:tcW w:w="1822" w:type="dxa"/>
             <w:tcBorders>
               <w:top w:val="single" w:sz="4" w:space="0" w:color="000000"/>
               <w:left w:val="single" w:sz="4" w:space="0" w:color="000000"/>
@@ -12322,7 +12305,7 @@
         </w:tc>
         <w:tc>
           <w:tcPr>
-            <w:tcW w:w="1177" w:type="dxa"/>
+            <w:tcW w:w="1175" w:type="dxa"/>
             <w:tcBorders>
               <w:top w:val="single" w:sz="4" w:space="0" w:color="000000"/>
               <w:left w:val="single" w:sz="4" w:space="0" w:color="000000"/>
@@ -12383,7 +12366,7 @@
         </w:tc>
         <w:tc>
           <w:tcPr>
-            <w:tcW w:w="2343" w:type="dxa"/>
+            <w:tcW w:w="2345" w:type="dxa"/>
             <w:tcBorders>
               <w:top w:val="single" w:sz="4" w:space="0" w:color="000000"/>
               <w:left w:val="single" w:sz="4" w:space="0" w:color="000000"/>
@@ -12444,7 +12427,7 @@
         </w:tc>
         <w:tc>
           <w:tcPr>
-            <w:tcW w:w="2128" w:type="dxa"/>
+            <w:tcW w:w="2130" w:type="dxa"/>
             <w:tcBorders>
               <w:top w:val="single" w:sz="4" w:space="0" w:color="000000"/>
               <w:left w:val="single" w:sz="4" w:space="0" w:color="000000"/>
@@ -12566,7 +12549,7 @@
         </w:tc>
         <w:tc>
           <w:tcPr>
-            <w:tcW w:w="1824" w:type="dxa"/>
+            <w:tcW w:w="1822" w:type="dxa"/>
             <w:tcBorders>
               <w:top w:val="single" w:sz="4" w:space="0" w:color="000000"/>
               <w:left w:val="single" w:sz="4" w:space="0" w:color="000000"/>
@@ -12691,7 +12674,7 @@
         </w:tc>
         <w:tc>
           <w:tcPr>
-            <w:tcW w:w="1177" w:type="dxa"/>
+            <w:tcW w:w="1175" w:type="dxa"/>
             <w:tcBorders>
               <w:top w:val="single" w:sz="4" w:space="0" w:color="000000"/>
               <w:left w:val="single" w:sz="4" w:space="0" w:color="000000"/>
@@ -12752,7 +12735,7 @@
         </w:tc>
         <w:tc>
           <w:tcPr>
-            <w:tcW w:w="2343" w:type="dxa"/>
+            <w:tcW w:w="2345" w:type="dxa"/>
             <w:tcBorders>
               <w:top w:val="single" w:sz="4" w:space="0" w:color="000000"/>
               <w:left w:val="single" w:sz="4" w:space="0" w:color="000000"/>
@@ -12813,7 +12796,7 @@
         </w:tc>
         <w:tc>
           <w:tcPr>
-            <w:tcW w:w="2128" w:type="dxa"/>
+            <w:tcW w:w="2130" w:type="dxa"/>
             <w:tcBorders>
               <w:top w:val="single" w:sz="4" w:space="0" w:color="000000"/>
               <w:left w:val="single" w:sz="4" w:space="0" w:color="000000"/>
@@ -12935,7 +12918,7 @@
         </w:tc>
         <w:tc>
           <w:tcPr>
-            <w:tcW w:w="1824" w:type="dxa"/>
+            <w:tcW w:w="1822" w:type="dxa"/>
             <w:tcBorders>
               <w:top w:val="single" w:sz="4" w:space="0" w:color="000000"/>
               <w:left w:val="single" w:sz="4" w:space="0" w:color="000000"/>
@@ -13060,7 +13043,7 @@
         </w:tc>
         <w:tc>
           <w:tcPr>
-            <w:tcW w:w="1177" w:type="dxa"/>
+            <w:tcW w:w="1175" w:type="dxa"/>
             <w:tcBorders>
               <w:top w:val="single" w:sz="4" w:space="0" w:color="000000"/>
               <w:left w:val="single" w:sz="4" w:space="0" w:color="000000"/>
@@ -13121,7 +13104,7 @@
         </w:tc>
         <w:tc>
           <w:tcPr>
-            <w:tcW w:w="2343" w:type="dxa"/>
+            <w:tcW w:w="2345" w:type="dxa"/>
             <w:tcBorders>
               <w:top w:val="single" w:sz="4" w:space="0" w:color="000000"/>
               <w:left w:val="single" w:sz="4" w:space="0" w:color="000000"/>
@@ -13182,7 +13165,7 @@
         </w:tc>
         <w:tc>
           <w:tcPr>
-            <w:tcW w:w="2128" w:type="dxa"/>
+            <w:tcW w:w="2130" w:type="dxa"/>
             <w:tcBorders>
               <w:top w:val="single" w:sz="4" w:space="0" w:color="000000"/>
               <w:left w:val="single" w:sz="4" w:space="0" w:color="000000"/>
@@ -13304,7 +13287,7 @@
         </w:tc>
         <w:tc>
           <w:tcPr>
-            <w:tcW w:w="1824" w:type="dxa"/>
+            <w:tcW w:w="1822" w:type="dxa"/>
             <w:tcBorders>
               <w:top w:val="single" w:sz="4" w:space="0" w:color="000000"/>
               <w:left w:val="single" w:sz="4" w:space="0" w:color="000000"/>
@@ -13429,7 +13412,7 @@
         </w:tc>
         <w:tc>
           <w:tcPr>
-            <w:tcW w:w="1177" w:type="dxa"/>
+            <w:tcW w:w="1175" w:type="dxa"/>
             <w:tcBorders>
               <w:top w:val="single" w:sz="4" w:space="0" w:color="000000"/>
               <w:left w:val="single" w:sz="4" w:space="0" w:color="000000"/>
@@ -13490,7 +13473,7 @@
         </w:tc>
         <w:tc>
           <w:tcPr>
-            <w:tcW w:w="2343" w:type="dxa"/>
+            <w:tcW w:w="2345" w:type="dxa"/>
             <w:tcBorders>
               <w:top w:val="single" w:sz="4" w:space="0" w:color="000000"/>
               <w:left w:val="single" w:sz="4" w:space="0" w:color="000000"/>
@@ -13551,7 +13534,7 @@
         </w:tc>
         <w:tc>
           <w:tcPr>
-            <w:tcW w:w="2128" w:type="dxa"/>
+            <w:tcW w:w="2130" w:type="dxa"/>
             <w:tcBorders>
               <w:top w:val="single" w:sz="4" w:space="0" w:color="000000"/>
               <w:left w:val="single" w:sz="4" w:space="0" w:color="000000"/>
@@ -13673,7 +13656,7 @@
         </w:tc>
         <w:tc>
           <w:tcPr>
-            <w:tcW w:w="1824" w:type="dxa"/>
+            <w:tcW w:w="1822" w:type="dxa"/>
             <w:tcBorders>
               <w:top w:val="single" w:sz="4" w:space="0" w:color="000000"/>
               <w:left w:val="single" w:sz="4" w:space="0" w:color="000000"/>
@@ -13798,7 +13781,7 @@
         </w:tc>
         <w:tc>
           <w:tcPr>
-            <w:tcW w:w="1177" w:type="dxa"/>
+            <w:tcW w:w="1175" w:type="dxa"/>
             <w:tcBorders>
               <w:top w:val="single" w:sz="4" w:space="0" w:color="000000"/>
               <w:left w:val="single" w:sz="4" w:space="0" w:color="000000"/>
@@ -13859,7 +13842,7 @@
         </w:tc>
         <w:tc>
           <w:tcPr>
-            <w:tcW w:w="2343" w:type="dxa"/>
+            <w:tcW w:w="2345" w:type="dxa"/>
             <w:tcBorders>
               <w:top w:val="single" w:sz="4" w:space="0" w:color="000000"/>
               <w:left w:val="single" w:sz="4" w:space="0" w:color="000000"/>
@@ -13920,7 +13903,7 @@
         </w:tc>
         <w:tc>
           <w:tcPr>
-            <w:tcW w:w="2128" w:type="dxa"/>
+            <w:tcW w:w="2130" w:type="dxa"/>
             <w:tcBorders>
               <w:top w:val="single" w:sz="4" w:space="0" w:color="000000"/>
               <w:left w:val="single" w:sz="4" w:space="0" w:color="000000"/>
@@ -14042,7 +14025,7 @@
         </w:tc>
         <w:tc>
           <w:tcPr>
-            <w:tcW w:w="1824" w:type="dxa"/>
+            <w:tcW w:w="1822" w:type="dxa"/>
             <w:tcBorders>
               <w:top w:val="single" w:sz="4" w:space="0" w:color="000000"/>
               <w:left w:val="single" w:sz="4" w:space="0" w:color="000000"/>
@@ -14167,7 +14150,7 @@
         </w:tc>
         <w:tc>
           <w:tcPr>
-            <w:tcW w:w="1177" w:type="dxa"/>
+            <w:tcW w:w="1175" w:type="dxa"/>
             <w:tcBorders>
               <w:top w:val="single" w:sz="4" w:space="0" w:color="000000"/>
               <w:left w:val="single" w:sz="4" w:space="0" w:color="000000"/>
@@ -14228,7 +14211,7 @@
         </w:tc>
         <w:tc>
           <w:tcPr>
-            <w:tcW w:w="2343" w:type="dxa"/>
+            <w:tcW w:w="2345" w:type="dxa"/>
             <w:tcBorders>
               <w:top w:val="single" w:sz="4" w:space="0" w:color="000000"/>
               <w:left w:val="single" w:sz="4" w:space="0" w:color="000000"/>
@@ -14289,7 +14272,7 @@
         </w:tc>
         <w:tc>
           <w:tcPr>
-            <w:tcW w:w="2128" w:type="dxa"/>
+            <w:tcW w:w="2130" w:type="dxa"/>
             <w:tcBorders>
               <w:top w:val="single" w:sz="4" w:space="0" w:color="000000"/>
               <w:left w:val="single" w:sz="4" w:space="0" w:color="000000"/>
@@ -14411,7 +14394,7 @@
         </w:tc>
         <w:tc>
           <w:tcPr>
-            <w:tcW w:w="1824" w:type="dxa"/>
+            <w:tcW w:w="1822" w:type="dxa"/>
             <w:tcBorders>
               <w:top w:val="single" w:sz="4" w:space="0" w:color="000000"/>
               <w:left w:val="single" w:sz="4" w:space="0" w:color="000000"/>
@@ -14536,7 +14519,7 @@
         </w:tc>
         <w:tc>
           <w:tcPr>
-            <w:tcW w:w="1177" w:type="dxa"/>
+            <w:tcW w:w="1175" w:type="dxa"/>
             <w:tcBorders>
               <w:top w:val="single" w:sz="4" w:space="0" w:color="000000"/>
               <w:left w:val="single" w:sz="4" w:space="0" w:color="000000"/>
@@ -14597,7 +14580,7 @@
         </w:tc>
         <w:tc>
           <w:tcPr>
-            <w:tcW w:w="2343" w:type="dxa"/>
+            <w:tcW w:w="2345" w:type="dxa"/>
             <w:tcBorders>
               <w:top w:val="single" w:sz="4" w:space="0" w:color="000000"/>
               <w:left w:val="single" w:sz="4" w:space="0" w:color="000000"/>
@@ -14658,7 +14641,7 @@
         </w:tc>
         <w:tc>
           <w:tcPr>
-            <w:tcW w:w="2128" w:type="dxa"/>
+            <w:tcW w:w="2130" w:type="dxa"/>
             <w:tcBorders>
               <w:top w:val="single" w:sz="4" w:space="0" w:color="000000"/>
               <w:left w:val="single" w:sz="4" w:space="0" w:color="000000"/>
@@ -14780,7 +14763,7 @@
         </w:tc>
         <w:tc>
           <w:tcPr>
-            <w:tcW w:w="1824" w:type="dxa"/>
+            <w:tcW w:w="1822" w:type="dxa"/>
             <w:tcBorders>
               <w:top w:val="single" w:sz="4" w:space="0" w:color="000000"/>
               <w:left w:val="single" w:sz="4" w:space="0" w:color="000000"/>
@@ -14905,7 +14888,7 @@
         </w:tc>
         <w:tc>
           <w:tcPr>
-            <w:tcW w:w="1177" w:type="dxa"/>
+            <w:tcW w:w="1175" w:type="dxa"/>
             <w:tcBorders>
               <w:top w:val="single" w:sz="4" w:space="0" w:color="000000"/>
               <w:left w:val="single" w:sz="4" w:space="0" w:color="000000"/>
@@ -14966,7 +14949,7 @@
         </w:tc>
         <w:tc>
           <w:tcPr>
-            <w:tcW w:w="2343" w:type="dxa"/>
+            <w:tcW w:w="2345" w:type="dxa"/>
             <w:tcBorders>
               <w:top w:val="single" w:sz="4" w:space="0" w:color="000000"/>
               <w:left w:val="single" w:sz="4" w:space="0" w:color="000000"/>
@@ -15027,7 +15010,7 @@
         </w:tc>
         <w:tc>
           <w:tcPr>
-            <w:tcW w:w="2128" w:type="dxa"/>
+            <w:tcW w:w="2130" w:type="dxa"/>
             <w:tcBorders>
               <w:top w:val="single" w:sz="4" w:space="0" w:color="000000"/>
               <w:left w:val="single" w:sz="4" w:space="0" w:color="000000"/>
@@ -15149,7 +15132,7 @@
         </w:tc>
         <w:tc>
           <w:tcPr>
-            <w:tcW w:w="1824" w:type="dxa"/>
+            <w:tcW w:w="1822" w:type="dxa"/>
             <w:tcBorders>
               <w:top w:val="single" w:sz="4" w:space="0" w:color="000000"/>
               <w:left w:val="single" w:sz="4" w:space="0" w:color="000000"/>
@@ -15274,7 +15257,7 @@
         </w:tc>
         <w:tc>
           <w:tcPr>
-            <w:tcW w:w="1177" w:type="dxa"/>
+            <w:tcW w:w="1175" w:type="dxa"/>
             <w:tcBorders>
               <w:top w:val="single" w:sz="4" w:space="0" w:color="000000"/>
               <w:left w:val="single" w:sz="4" w:space="0" w:color="000000"/>
@@ -15335,7 +15318,7 @@
         </w:tc>
         <w:tc>
           <w:tcPr>
-            <w:tcW w:w="2343" w:type="dxa"/>
+            <w:tcW w:w="2345" w:type="dxa"/>
             <w:tcBorders>
               <w:top w:val="single" w:sz="4" w:space="0" w:color="000000"/>
               <w:left w:val="single" w:sz="4" w:space="0" w:color="000000"/>
@@ -15396,7 +15379,7 @@
         </w:tc>
         <w:tc>
           <w:tcPr>
-            <w:tcW w:w="2128" w:type="dxa"/>
+            <w:tcW w:w="2130" w:type="dxa"/>
             <w:tcBorders>
               <w:top w:val="single" w:sz="4" w:space="0" w:color="000000"/>
               <w:left w:val="single" w:sz="4" w:space="0" w:color="000000"/>
@@ -15518,7 +15501,7 @@
         </w:tc>
         <w:tc>
           <w:tcPr>
-            <w:tcW w:w="1824" w:type="dxa"/>
+            <w:tcW w:w="1822" w:type="dxa"/>
             <w:tcBorders>
               <w:top w:val="single" w:sz="4" w:space="0" w:color="000000"/>
               <w:left w:val="single" w:sz="4" w:space="0" w:color="000000"/>
@@ -15645,7 +15628,7 @@
         </w:tc>
         <w:tc>
           <w:tcPr>
-            <w:tcW w:w="1177" w:type="dxa"/>
+            <w:tcW w:w="1175" w:type="dxa"/>
             <w:tcBorders>
               <w:top w:val="single" w:sz="4" w:space="0" w:color="000000"/>
               <w:left w:val="single" w:sz="4" w:space="0" w:color="000000"/>
@@ -15706,7 +15689,7 @@
         </w:tc>
         <w:tc>
           <w:tcPr>
-            <w:tcW w:w="2343" w:type="dxa"/>
+            <w:tcW w:w="2345" w:type="dxa"/>
             <w:tcBorders>
               <w:top w:val="single" w:sz="4" w:space="0" w:color="000000"/>
               <w:left w:val="single" w:sz="4" w:space="0" w:color="000000"/>
@@ -15767,7 +15750,7 @@
         </w:tc>
         <w:tc>
           <w:tcPr>
-            <w:tcW w:w="2128" w:type="dxa"/>
+            <w:tcW w:w="2130" w:type="dxa"/>
             <w:tcBorders>
               <w:top w:val="single" w:sz="4" w:space="0" w:color="000000"/>
               <w:left w:val="single" w:sz="4" w:space="0" w:color="000000"/>
@@ -15889,7 +15872,7 @@
         </w:tc>
         <w:tc>
           <w:tcPr>
-            <w:tcW w:w="1824" w:type="dxa"/>
+            <w:tcW w:w="1822" w:type="dxa"/>
             <w:tcBorders>
               <w:top w:val="single" w:sz="4" w:space="0" w:color="000000"/>
               <w:left w:val="single" w:sz="4" w:space="0" w:color="000000"/>
@@ -16014,7 +15997,7 @@
         </w:tc>
         <w:tc>
           <w:tcPr>
-            <w:tcW w:w="1177" w:type="dxa"/>
+            <w:tcW w:w="1175" w:type="dxa"/>
             <w:tcBorders>
               <w:top w:val="single" w:sz="4" w:space="0" w:color="000000"/>
               <w:left w:val="single" w:sz="4" w:space="0" w:color="000000"/>
@@ -16075,7 +16058,7 @@
         </w:tc>
         <w:tc>
           <w:tcPr>
-            <w:tcW w:w="2343" w:type="dxa"/>
+            <w:tcW w:w="2345" w:type="dxa"/>
             <w:tcBorders>
               <w:top w:val="single" w:sz="4" w:space="0" w:color="000000"/>
               <w:left w:val="single" w:sz="4" w:space="0" w:color="000000"/>
@@ -16136,7 +16119,7 @@
         </w:tc>
         <w:tc>
           <w:tcPr>
-            <w:tcW w:w="2128" w:type="dxa"/>
+            <w:tcW w:w="2130" w:type="dxa"/>
             <w:tcBorders>
               <w:top w:val="single" w:sz="4" w:space="0" w:color="000000"/>
               <w:left w:val="single" w:sz="4" w:space="0" w:color="000000"/>
@@ -16258,7 +16241,7 @@
         </w:tc>
         <w:tc>
           <w:tcPr>
-            <w:tcW w:w="1824" w:type="dxa"/>
+            <w:tcW w:w="1822" w:type="dxa"/>
             <w:tcBorders>
               <w:top w:val="single" w:sz="4" w:space="0" w:color="000000"/>
               <w:left w:val="single" w:sz="4" w:space="0" w:color="000000"/>
@@ -16559,9 +16542,9 @@
         <w:gridCol w:w="1854"/>
         <w:gridCol w:w="1886"/>
         <w:gridCol w:w="1883"/>
-        <w:gridCol w:w="1211"/>
-        <w:gridCol w:w="1347"/>
-        <w:gridCol w:w="1342"/>
+        <w:gridCol w:w="1214"/>
+        <w:gridCol w:w="1346"/>
+        <w:gridCol w:w="1340"/>
       </w:tblGrid>
       <w:tr>
         <w:trPr>
@@ -17149,7 +17132,7 @@
         </w:tc>
         <w:tc>
           <w:tcPr>
-            <w:tcW w:w="1211" w:type="dxa"/>
+            <w:tcW w:w="1214" w:type="dxa"/>
             <w:tcBorders>
               <w:top w:val="single" w:sz="4" w:space="0" w:color="000000"/>
               <w:left w:val="single" w:sz="4" w:space="0" w:color="000000"/>
@@ -17288,7 +17271,7 @@
         </w:tc>
         <w:tc>
           <w:tcPr>
-            <w:tcW w:w="1347" w:type="dxa"/>
+            <w:tcW w:w="1346" w:type="dxa"/>
             <w:tcBorders>
               <w:top w:val="single" w:sz="4" w:space="0" w:color="000000"/>
               <w:left w:val="single" w:sz="4" w:space="0" w:color="000000"/>
@@ -17396,7 +17379,7 @@
         </w:tc>
         <w:tc>
           <w:tcPr>
-            <w:tcW w:w="1342" w:type="dxa"/>
+            <w:tcW w:w="1340" w:type="dxa"/>
             <w:tcBorders>
               <w:top w:val="single" w:sz="4" w:space="0" w:color="000000"/>
               <w:left w:val="single" w:sz="4" w:space="0" w:color="000000"/>
@@ -17814,7 +17797,7 @@
         </w:tc>
         <w:tc>
           <w:tcPr>
-            <w:tcW w:w="1211" w:type="dxa"/>
+            <w:tcW w:w="1214" w:type="dxa"/>
             <w:tcBorders>
               <w:top w:val="single" w:sz="4" w:space="0" w:color="000000"/>
               <w:left w:val="single" w:sz="4" w:space="0" w:color="000000"/>
@@ -17875,7 +17858,7 @@
         </w:tc>
         <w:tc>
           <w:tcPr>
-            <w:tcW w:w="1347" w:type="dxa"/>
+            <w:tcW w:w="1346" w:type="dxa"/>
             <w:tcBorders>
               <w:top w:val="single" w:sz="4" w:space="0" w:color="000000"/>
               <w:left w:val="single" w:sz="4" w:space="0" w:color="000000"/>
@@ -17936,7 +17919,7 @@
         </w:tc>
         <w:tc>
           <w:tcPr>
-            <w:tcW w:w="1342" w:type="dxa"/>
+            <w:tcW w:w="1340" w:type="dxa"/>
             <w:tcBorders>
               <w:top w:val="single" w:sz="4" w:space="0" w:color="000000"/>
               <w:left w:val="single" w:sz="4" w:space="0" w:color="000000"/>
@@ -18307,7 +18290,7 @@
         </w:tc>
         <w:tc>
           <w:tcPr>
-            <w:tcW w:w="1211" w:type="dxa"/>
+            <w:tcW w:w="1214" w:type="dxa"/>
             <w:tcBorders>
               <w:top w:val="single" w:sz="4" w:space="0" w:color="000000"/>
               <w:left w:val="single" w:sz="4" w:space="0" w:color="000000"/>
@@ -18368,7 +18351,7 @@
         </w:tc>
         <w:tc>
           <w:tcPr>
-            <w:tcW w:w="1347" w:type="dxa"/>
+            <w:tcW w:w="1346" w:type="dxa"/>
             <w:tcBorders>
               <w:top w:val="single" w:sz="4" w:space="0" w:color="000000"/>
               <w:left w:val="single" w:sz="4" w:space="0" w:color="000000"/>
@@ -18429,7 +18412,7 @@
         </w:tc>
         <w:tc>
           <w:tcPr>
-            <w:tcW w:w="1342" w:type="dxa"/>
+            <w:tcW w:w="1340" w:type="dxa"/>
             <w:tcBorders>
               <w:top w:val="single" w:sz="4" w:space="0" w:color="000000"/>
               <w:left w:val="single" w:sz="4" w:space="0" w:color="000000"/>
@@ -18800,7 +18783,7 @@
         </w:tc>
         <w:tc>
           <w:tcPr>
-            <w:tcW w:w="1211" w:type="dxa"/>
+            <w:tcW w:w="1214" w:type="dxa"/>
             <w:tcBorders>
               <w:top w:val="single" w:sz="4" w:space="0" w:color="000000"/>
               <w:left w:val="single" w:sz="4" w:space="0" w:color="000000"/>
@@ -18861,7 +18844,7 @@
         </w:tc>
         <w:tc>
           <w:tcPr>
-            <w:tcW w:w="1347" w:type="dxa"/>
+            <w:tcW w:w="1346" w:type="dxa"/>
             <w:tcBorders>
               <w:top w:val="single" w:sz="4" w:space="0" w:color="000000"/>
               <w:left w:val="single" w:sz="4" w:space="0" w:color="000000"/>
@@ -18922,7 +18905,7 @@
         </w:tc>
         <w:tc>
           <w:tcPr>
-            <w:tcW w:w="1342" w:type="dxa"/>
+            <w:tcW w:w="1340" w:type="dxa"/>
             <w:tcBorders>
               <w:top w:val="single" w:sz="4" w:space="0" w:color="000000"/>
               <w:left w:val="single" w:sz="4" w:space="0" w:color="000000"/>
@@ -19293,7 +19276,7 @@
         </w:tc>
         <w:tc>
           <w:tcPr>
-            <w:tcW w:w="1211" w:type="dxa"/>
+            <w:tcW w:w="1214" w:type="dxa"/>
             <w:tcBorders>
               <w:top w:val="single" w:sz="4" w:space="0" w:color="000000"/>
               <w:left w:val="single" w:sz="4" w:space="0" w:color="000000"/>
@@ -19354,7 +19337,7 @@
         </w:tc>
         <w:tc>
           <w:tcPr>
-            <w:tcW w:w="1347" w:type="dxa"/>
+            <w:tcW w:w="1346" w:type="dxa"/>
             <w:tcBorders>
               <w:top w:val="single" w:sz="4" w:space="0" w:color="000000"/>
               <w:left w:val="single" w:sz="4" w:space="0" w:color="000000"/>
@@ -19415,7 +19398,7 @@
         </w:tc>
         <w:tc>
           <w:tcPr>
-            <w:tcW w:w="1342" w:type="dxa"/>
+            <w:tcW w:w="1340" w:type="dxa"/>
             <w:tcBorders>
               <w:top w:val="single" w:sz="4" w:space="0" w:color="000000"/>
               <w:left w:val="single" w:sz="4" w:space="0" w:color="000000"/>
@@ -19786,7 +19769,7 @@
         </w:tc>
         <w:tc>
           <w:tcPr>
-            <w:tcW w:w="1211" w:type="dxa"/>
+            <w:tcW w:w="1214" w:type="dxa"/>
             <w:tcBorders>
               <w:top w:val="single" w:sz="4" w:space="0" w:color="000000"/>
               <w:left w:val="single" w:sz="4" w:space="0" w:color="000000"/>
@@ -19847,7 +19830,7 @@
         </w:tc>
         <w:tc>
           <w:tcPr>
-            <w:tcW w:w="1347" w:type="dxa"/>
+            <w:tcW w:w="1346" w:type="dxa"/>
             <w:tcBorders>
               <w:top w:val="single" w:sz="4" w:space="0" w:color="000000"/>
               <w:left w:val="single" w:sz="4" w:space="0" w:color="000000"/>
@@ -19908,7 +19891,7 @@
         </w:tc>
         <w:tc>
           <w:tcPr>
-            <w:tcW w:w="1342" w:type="dxa"/>
+            <w:tcW w:w="1340" w:type="dxa"/>
             <w:tcBorders>
               <w:top w:val="single" w:sz="4" w:space="0" w:color="000000"/>
               <w:left w:val="single" w:sz="4" w:space="0" w:color="000000"/>
@@ -20279,7 +20262,7 @@
         </w:tc>
         <w:tc>
           <w:tcPr>
-            <w:tcW w:w="1211" w:type="dxa"/>
+            <w:tcW w:w="1214" w:type="dxa"/>
             <w:tcBorders>
               <w:top w:val="single" w:sz="4" w:space="0" w:color="000000"/>
               <w:left w:val="single" w:sz="4" w:space="0" w:color="000000"/>
@@ -20340,7 +20323,7 @@
         </w:tc>
         <w:tc>
           <w:tcPr>
-            <w:tcW w:w="1347" w:type="dxa"/>
+            <w:tcW w:w="1346" w:type="dxa"/>
             <w:tcBorders>
               <w:top w:val="single" w:sz="4" w:space="0" w:color="000000"/>
               <w:left w:val="single" w:sz="4" w:space="0" w:color="000000"/>
@@ -20401,7 +20384,7 @@
         </w:tc>
         <w:tc>
           <w:tcPr>
-            <w:tcW w:w="1342" w:type="dxa"/>
+            <w:tcW w:w="1340" w:type="dxa"/>
             <w:tcBorders>
               <w:top w:val="single" w:sz="4" w:space="0" w:color="000000"/>
               <w:left w:val="single" w:sz="4" w:space="0" w:color="000000"/>
@@ -20772,7 +20755,7 @@
         </w:tc>
         <w:tc>
           <w:tcPr>
-            <w:tcW w:w="1211" w:type="dxa"/>
+            <w:tcW w:w="1214" w:type="dxa"/>
             <w:tcBorders>
               <w:top w:val="single" w:sz="4" w:space="0" w:color="000000"/>
               <w:left w:val="single" w:sz="4" w:space="0" w:color="000000"/>
@@ -20833,7 +20816,7 @@
         </w:tc>
         <w:tc>
           <w:tcPr>
-            <w:tcW w:w="1347" w:type="dxa"/>
+            <w:tcW w:w="1346" w:type="dxa"/>
             <w:tcBorders>
               <w:top w:val="single" w:sz="4" w:space="0" w:color="000000"/>
               <w:left w:val="single" w:sz="4" w:space="0" w:color="000000"/>
@@ -20894,7 +20877,7 @@
         </w:tc>
         <w:tc>
           <w:tcPr>
-            <w:tcW w:w="1342" w:type="dxa"/>
+            <w:tcW w:w="1340" w:type="dxa"/>
             <w:tcBorders>
               <w:top w:val="single" w:sz="4" w:space="0" w:color="000000"/>
               <w:left w:val="single" w:sz="4" w:space="0" w:color="000000"/>
@@ -21265,7 +21248,7 @@
         </w:tc>
         <w:tc>
           <w:tcPr>
-            <w:tcW w:w="1211" w:type="dxa"/>
+            <w:tcW w:w="1214" w:type="dxa"/>
             <w:tcBorders>
               <w:top w:val="single" w:sz="4" w:space="0" w:color="000000"/>
               <w:left w:val="single" w:sz="4" w:space="0" w:color="000000"/>
@@ -21326,7 +21309,7 @@
         </w:tc>
         <w:tc>
           <w:tcPr>
-            <w:tcW w:w="1347" w:type="dxa"/>
+            <w:tcW w:w="1346" w:type="dxa"/>
             <w:tcBorders>
               <w:top w:val="single" w:sz="4" w:space="0" w:color="000000"/>
               <w:left w:val="single" w:sz="4" w:space="0" w:color="000000"/>
@@ -21387,7 +21370,7 @@
         </w:tc>
         <w:tc>
           <w:tcPr>
-            <w:tcW w:w="1342" w:type="dxa"/>
+            <w:tcW w:w="1340" w:type="dxa"/>
             <w:tcBorders>
               <w:top w:val="single" w:sz="4" w:space="0" w:color="000000"/>
               <w:left w:val="single" w:sz="4" w:space="0" w:color="000000"/>
@@ -21758,7 +21741,7 @@
         </w:tc>
         <w:tc>
           <w:tcPr>
-            <w:tcW w:w="1211" w:type="dxa"/>
+            <w:tcW w:w="1214" w:type="dxa"/>
             <w:tcBorders>
               <w:top w:val="single" w:sz="4" w:space="0" w:color="000000"/>
               <w:left w:val="single" w:sz="4" w:space="0" w:color="000000"/>
@@ -21819,7 +21802,7 @@
         </w:tc>
         <w:tc>
           <w:tcPr>
-            <w:tcW w:w="1347" w:type="dxa"/>
+            <w:tcW w:w="1346" w:type="dxa"/>
             <w:tcBorders>
               <w:top w:val="single" w:sz="4" w:space="0" w:color="000000"/>
               <w:left w:val="single" w:sz="4" w:space="0" w:color="000000"/>
@@ -21880,7 +21863,7 @@
         </w:tc>
         <w:tc>
           <w:tcPr>
-            <w:tcW w:w="1342" w:type="dxa"/>
+            <w:tcW w:w="1340" w:type="dxa"/>
             <w:tcBorders>
               <w:top w:val="single" w:sz="4" w:space="0" w:color="000000"/>
               <w:left w:val="single" w:sz="4" w:space="0" w:color="000000"/>
@@ -22251,7 +22234,7 @@
         </w:tc>
         <w:tc>
           <w:tcPr>
-            <w:tcW w:w="1211" w:type="dxa"/>
+            <w:tcW w:w="1214" w:type="dxa"/>
             <w:tcBorders>
               <w:top w:val="single" w:sz="4" w:space="0" w:color="000000"/>
               <w:left w:val="single" w:sz="4" w:space="0" w:color="000000"/>
@@ -22312,7 +22295,7 @@
         </w:tc>
         <w:tc>
           <w:tcPr>
-            <w:tcW w:w="1347" w:type="dxa"/>
+            <w:tcW w:w="1346" w:type="dxa"/>
             <w:tcBorders>
               <w:top w:val="single" w:sz="4" w:space="0" w:color="000000"/>
               <w:left w:val="single" w:sz="4" w:space="0" w:color="000000"/>
@@ -22373,7 +22356,7 @@
         </w:tc>
         <w:tc>
           <w:tcPr>
-            <w:tcW w:w="1342" w:type="dxa"/>
+            <w:tcW w:w="1340" w:type="dxa"/>
             <w:tcBorders>
               <w:top w:val="single" w:sz="4" w:space="0" w:color="000000"/>
               <w:left w:val="single" w:sz="4" w:space="0" w:color="000000"/>
@@ -22744,7 +22727,7 @@
         </w:tc>
         <w:tc>
           <w:tcPr>
-            <w:tcW w:w="1211" w:type="dxa"/>
+            <w:tcW w:w="1214" w:type="dxa"/>
             <w:tcBorders>
               <w:top w:val="single" w:sz="4" w:space="0" w:color="000000"/>
               <w:left w:val="single" w:sz="4" w:space="0" w:color="000000"/>
@@ -22805,7 +22788,7 @@
         </w:tc>
         <w:tc>
           <w:tcPr>
-            <w:tcW w:w="1347" w:type="dxa"/>
+            <w:tcW w:w="1346" w:type="dxa"/>
             <w:tcBorders>
               <w:top w:val="single" w:sz="4" w:space="0" w:color="000000"/>
               <w:left w:val="single" w:sz="4" w:space="0" w:color="000000"/>
@@ -22866,7 +22849,7 @@
         </w:tc>
         <w:tc>
           <w:tcPr>
-            <w:tcW w:w="1342" w:type="dxa"/>
+            <w:tcW w:w="1340" w:type="dxa"/>
             <w:tcBorders>
               <w:top w:val="single" w:sz="4" w:space="0" w:color="000000"/>
               <w:left w:val="single" w:sz="4" w:space="0" w:color="000000"/>
@@ -23237,7 +23220,7 @@
         </w:tc>
         <w:tc>
           <w:tcPr>
-            <w:tcW w:w="1211" w:type="dxa"/>
+            <w:tcW w:w="1214" w:type="dxa"/>
             <w:tcBorders>
               <w:top w:val="single" w:sz="4" w:space="0" w:color="000000"/>
               <w:left w:val="single" w:sz="4" w:space="0" w:color="000000"/>
@@ -23298,7 +23281,7 @@
         </w:tc>
         <w:tc>
           <w:tcPr>
-            <w:tcW w:w="1347" w:type="dxa"/>
+            <w:tcW w:w="1346" w:type="dxa"/>
             <w:tcBorders>
               <w:top w:val="single" w:sz="4" w:space="0" w:color="000000"/>
               <w:left w:val="single" w:sz="4" w:space="0" w:color="000000"/>
@@ -23359,7 +23342,7 @@
         </w:tc>
         <w:tc>
           <w:tcPr>
-            <w:tcW w:w="1342" w:type="dxa"/>
+            <w:tcW w:w="1340" w:type="dxa"/>
             <w:tcBorders>
               <w:top w:val="single" w:sz="4" w:space="0" w:color="000000"/>
               <w:left w:val="single" w:sz="4" w:space="0" w:color="000000"/>
@@ -23730,7 +23713,7 @@
         </w:tc>
         <w:tc>
           <w:tcPr>
-            <w:tcW w:w="1211" w:type="dxa"/>
+            <w:tcW w:w="1214" w:type="dxa"/>
             <w:tcBorders>
               <w:top w:val="single" w:sz="4" w:space="0" w:color="000000"/>
               <w:left w:val="single" w:sz="4" w:space="0" w:color="000000"/>
@@ -23791,7 +23774,7 @@
         </w:tc>
         <w:tc>
           <w:tcPr>
-            <w:tcW w:w="1347" w:type="dxa"/>
+            <w:tcW w:w="1346" w:type="dxa"/>
             <w:tcBorders>
               <w:top w:val="single" w:sz="4" w:space="0" w:color="000000"/>
               <w:left w:val="single" w:sz="4" w:space="0" w:color="000000"/>
@@ -23852,7 +23835,7 @@
         </w:tc>
         <w:tc>
           <w:tcPr>
-            <w:tcW w:w="1342" w:type="dxa"/>
+            <w:tcW w:w="1340" w:type="dxa"/>
             <w:tcBorders>
               <w:top w:val="single" w:sz="4" w:space="0" w:color="000000"/>
               <w:left w:val="single" w:sz="4" w:space="0" w:color="000000"/>
@@ -24138,9 +24121,9 @@
         <w:gridCol w:w="1854"/>
         <w:gridCol w:w="1886"/>
         <w:gridCol w:w="1883"/>
-        <w:gridCol w:w="1211"/>
-        <w:gridCol w:w="1347"/>
-        <w:gridCol w:w="1342"/>
+        <w:gridCol w:w="1214"/>
+        <w:gridCol w:w="1346"/>
+        <w:gridCol w:w="1340"/>
       </w:tblGrid>
       <w:tr>
         <w:trPr>
@@ -24664,7 +24647,7 @@
         </w:tc>
         <w:tc>
           <w:tcPr>
-            <w:tcW w:w="1211" w:type="dxa"/>
+            <w:tcW w:w="1214" w:type="dxa"/>
             <w:tcBorders>
               <w:top w:val="single" w:sz="4" w:space="0" w:color="000000"/>
               <w:left w:val="single" w:sz="4" w:space="0" w:color="000000"/>
@@ -24803,7 +24786,7 @@
         </w:tc>
         <w:tc>
           <w:tcPr>
-            <w:tcW w:w="1347" w:type="dxa"/>
+            <w:tcW w:w="1346" w:type="dxa"/>
             <w:tcBorders>
               <w:top w:val="single" w:sz="4" w:space="0" w:color="000000"/>
               <w:left w:val="single" w:sz="4" w:space="0" w:color="000000"/>
@@ -24911,7 +24894,7 @@
         </w:tc>
         <w:tc>
           <w:tcPr>
-            <w:tcW w:w="1342" w:type="dxa"/>
+            <w:tcW w:w="1340" w:type="dxa"/>
             <w:tcBorders>
               <w:top w:val="single" w:sz="4" w:space="0" w:color="000000"/>
               <w:left w:val="single" w:sz="4" w:space="0" w:color="000000"/>
@@ -25329,7 +25312,7 @@
         </w:tc>
         <w:tc>
           <w:tcPr>
-            <w:tcW w:w="1211" w:type="dxa"/>
+            <w:tcW w:w="1214" w:type="dxa"/>
             <w:tcBorders>
               <w:top w:val="single" w:sz="4" w:space="0" w:color="000000"/>
               <w:left w:val="single" w:sz="4" w:space="0" w:color="000000"/>
@@ -25390,7 +25373,7 @@
         </w:tc>
         <w:tc>
           <w:tcPr>
-            <w:tcW w:w="1347" w:type="dxa"/>
+            <w:tcW w:w="1346" w:type="dxa"/>
             <w:tcBorders>
               <w:top w:val="single" w:sz="4" w:space="0" w:color="000000"/>
               <w:left w:val="single" w:sz="4" w:space="0" w:color="000000"/>
@@ -25451,7 +25434,7 @@
         </w:tc>
         <w:tc>
           <w:tcPr>
-            <w:tcW w:w="1342" w:type="dxa"/>
+            <w:tcW w:w="1340" w:type="dxa"/>
             <w:tcBorders>
               <w:top w:val="single" w:sz="4" w:space="0" w:color="000000"/>
               <w:left w:val="single" w:sz="4" w:space="0" w:color="000000"/>
@@ -25920,7 +25903,7 @@
         </w:tc>
         <w:tc>
           <w:tcPr>
-            <w:tcW w:w="1211" w:type="dxa"/>
+            <w:tcW w:w="1214" w:type="dxa"/>
             <w:tcBorders>
               <w:top w:val="single" w:sz="4" w:space="0" w:color="000000"/>
               <w:left w:val="single" w:sz="4" w:space="0" w:color="000000"/>
@@ -26030,7 +26013,7 @@
         </w:tc>
         <w:tc>
           <w:tcPr>
-            <w:tcW w:w="1347" w:type="dxa"/>
+            <w:tcW w:w="1346" w:type="dxa"/>
             <w:tcBorders>
               <w:top w:val="single" w:sz="4" w:space="0" w:color="000000"/>
               <w:left w:val="single" w:sz="4" w:space="0" w:color="000000"/>
@@ -26091,7 +26074,7 @@
         </w:tc>
         <w:tc>
           <w:tcPr>
-            <w:tcW w:w="1342" w:type="dxa"/>
+            <w:tcW w:w="1340" w:type="dxa"/>
             <w:tcBorders>
               <w:top w:val="single" w:sz="4" w:space="0" w:color="000000"/>
               <w:left w:val="single" w:sz="4" w:space="0" w:color="000000"/>
@@ -26462,7 +26445,7 @@
         </w:tc>
         <w:tc>
           <w:tcPr>
-            <w:tcW w:w="1211" w:type="dxa"/>
+            <w:tcW w:w="1214" w:type="dxa"/>
             <w:tcBorders>
               <w:top w:val="single" w:sz="4" w:space="0" w:color="000000"/>
               <w:left w:val="single" w:sz="4" w:space="0" w:color="000000"/>
@@ -26523,7 +26506,7 @@
         </w:tc>
         <w:tc>
           <w:tcPr>
-            <w:tcW w:w="1347" w:type="dxa"/>
+            <w:tcW w:w="1346" w:type="dxa"/>
             <w:tcBorders>
               <w:top w:val="single" w:sz="4" w:space="0" w:color="000000"/>
               <w:left w:val="single" w:sz="4" w:space="0" w:color="000000"/>
@@ -26584,7 +26567,7 @@
         </w:tc>
         <w:tc>
           <w:tcPr>
-            <w:tcW w:w="1342" w:type="dxa"/>
+            <w:tcW w:w="1340" w:type="dxa"/>
             <w:tcBorders>
               <w:top w:val="single" w:sz="4" w:space="0" w:color="000000"/>
               <w:left w:val="single" w:sz="4" w:space="0" w:color="000000"/>
@@ -26955,7 +26938,7 @@
         </w:tc>
         <w:tc>
           <w:tcPr>
-            <w:tcW w:w="1211" w:type="dxa"/>
+            <w:tcW w:w="1214" w:type="dxa"/>
             <w:tcBorders>
               <w:top w:val="single" w:sz="4" w:space="0" w:color="000000"/>
               <w:left w:val="single" w:sz="4" w:space="0" w:color="000000"/>
@@ -27016,7 +26999,7 @@
         </w:tc>
         <w:tc>
           <w:tcPr>
-            <w:tcW w:w="1347" w:type="dxa"/>
+            <w:tcW w:w="1346" w:type="dxa"/>
             <w:tcBorders>
               <w:top w:val="single" w:sz="4" w:space="0" w:color="000000"/>
               <w:left w:val="single" w:sz="4" w:space="0" w:color="000000"/>
@@ -27077,7 +27060,7 @@
         </w:tc>
         <w:tc>
           <w:tcPr>
-            <w:tcW w:w="1342" w:type="dxa"/>
+            <w:tcW w:w="1340" w:type="dxa"/>
             <w:tcBorders>
               <w:top w:val="single" w:sz="4" w:space="0" w:color="000000"/>
               <w:left w:val="single" w:sz="4" w:space="0" w:color="000000"/>
@@ -27448,7 +27431,7 @@
         </w:tc>
         <w:tc>
           <w:tcPr>
-            <w:tcW w:w="1211" w:type="dxa"/>
+            <w:tcW w:w="1214" w:type="dxa"/>
             <w:tcBorders>
               <w:top w:val="single" w:sz="4" w:space="0" w:color="000000"/>
               <w:left w:val="single" w:sz="4" w:space="0" w:color="000000"/>
@@ -27509,7 +27492,7 @@
         </w:tc>
         <w:tc>
           <w:tcPr>
-            <w:tcW w:w="1347" w:type="dxa"/>
+            <w:tcW w:w="1346" w:type="dxa"/>
             <w:tcBorders>
               <w:top w:val="single" w:sz="4" w:space="0" w:color="000000"/>
               <w:left w:val="single" w:sz="4" w:space="0" w:color="000000"/>
@@ -27570,7 +27553,7 @@
         </w:tc>
         <w:tc>
           <w:tcPr>
-            <w:tcW w:w="1342" w:type="dxa"/>
+            <w:tcW w:w="1340" w:type="dxa"/>
             <w:tcBorders>
               <w:top w:val="single" w:sz="4" w:space="0" w:color="000000"/>
               <w:left w:val="single" w:sz="4" w:space="0" w:color="000000"/>
@@ -27941,7 +27924,7 @@
         </w:tc>
         <w:tc>
           <w:tcPr>
-            <w:tcW w:w="1211" w:type="dxa"/>
+            <w:tcW w:w="1214" w:type="dxa"/>
             <w:tcBorders>
               <w:top w:val="single" w:sz="4" w:space="0" w:color="000000"/>
               <w:left w:val="single" w:sz="4" w:space="0" w:color="000000"/>
@@ -28051,7 +28034,7 @@
         </w:tc>
         <w:tc>
           <w:tcPr>
-            <w:tcW w:w="1347" w:type="dxa"/>
+            <w:tcW w:w="1346" w:type="dxa"/>
             <w:tcBorders>
               <w:top w:val="single" w:sz="4" w:space="0" w:color="000000"/>
               <w:left w:val="single" w:sz="4" w:space="0" w:color="000000"/>
@@ -28112,7 +28095,7 @@
         </w:tc>
         <w:tc>
           <w:tcPr>
-            <w:tcW w:w="1342" w:type="dxa"/>
+            <w:tcW w:w="1340" w:type="dxa"/>
             <w:tcBorders>
               <w:top w:val="single" w:sz="4" w:space="0" w:color="000000"/>
               <w:left w:val="single" w:sz="4" w:space="0" w:color="000000"/>
@@ -28532,7 +28515,7 @@
         </w:tc>
         <w:tc>
           <w:tcPr>
-            <w:tcW w:w="1211" w:type="dxa"/>
+            <w:tcW w:w="1214" w:type="dxa"/>
             <w:tcBorders>
               <w:top w:val="single" w:sz="4" w:space="0" w:color="000000"/>
               <w:left w:val="single" w:sz="4" w:space="0" w:color="000000"/>
@@ -28593,7 +28576,7 @@
         </w:tc>
         <w:tc>
           <w:tcPr>
-            <w:tcW w:w="1347" w:type="dxa"/>
+            <w:tcW w:w="1346" w:type="dxa"/>
             <w:tcBorders>
               <w:top w:val="single" w:sz="4" w:space="0" w:color="000000"/>
               <w:left w:val="single" w:sz="4" w:space="0" w:color="000000"/>
@@ -28654,7 +28637,7 @@
         </w:tc>
         <w:tc>
           <w:tcPr>
-            <w:tcW w:w="1342" w:type="dxa"/>
+            <w:tcW w:w="1340" w:type="dxa"/>
             <w:tcBorders>
               <w:top w:val="single" w:sz="4" w:space="0" w:color="000000"/>
               <w:left w:val="single" w:sz="4" w:space="0" w:color="000000"/>
@@ -29025,7 +29008,7 @@
         </w:tc>
         <w:tc>
           <w:tcPr>
-            <w:tcW w:w="1211" w:type="dxa"/>
+            <w:tcW w:w="1214" w:type="dxa"/>
             <w:tcBorders>
               <w:top w:val="single" w:sz="4" w:space="0" w:color="000000"/>
               <w:left w:val="single" w:sz="4" w:space="0" w:color="000000"/>
@@ -29086,7 +29069,7 @@
         </w:tc>
         <w:tc>
           <w:tcPr>
-            <w:tcW w:w="1347" w:type="dxa"/>
+            <w:tcW w:w="1346" w:type="dxa"/>
             <w:tcBorders>
               <w:top w:val="single" w:sz="4" w:space="0" w:color="000000"/>
               <w:left w:val="single" w:sz="4" w:space="0" w:color="000000"/>
@@ -29147,7 +29130,7 @@
         </w:tc>
         <w:tc>
           <w:tcPr>
-            <w:tcW w:w="1342" w:type="dxa"/>
+            <w:tcW w:w="1340" w:type="dxa"/>
             <w:tcBorders>
               <w:top w:val="single" w:sz="4" w:space="0" w:color="000000"/>
               <w:left w:val="single" w:sz="4" w:space="0" w:color="000000"/>
@@ -29518,7 +29501,7 @@
         </w:tc>
         <w:tc>
           <w:tcPr>
-            <w:tcW w:w="1211" w:type="dxa"/>
+            <w:tcW w:w="1214" w:type="dxa"/>
             <w:tcBorders>
               <w:top w:val="single" w:sz="4" w:space="0" w:color="000000"/>
               <w:left w:val="single" w:sz="4" w:space="0" w:color="000000"/>
@@ -29579,7 +29562,7 @@
         </w:tc>
         <w:tc>
           <w:tcPr>
-            <w:tcW w:w="1347" w:type="dxa"/>
+            <w:tcW w:w="1346" w:type="dxa"/>
             <w:tcBorders>
               <w:top w:val="single" w:sz="4" w:space="0" w:color="000000"/>
               <w:left w:val="single" w:sz="4" w:space="0" w:color="000000"/>
@@ -29640,7 +29623,7 @@
         </w:tc>
         <w:tc>
           <w:tcPr>
-            <w:tcW w:w="1342" w:type="dxa"/>
+            <w:tcW w:w="1340" w:type="dxa"/>
             <w:tcBorders>
               <w:top w:val="single" w:sz="4" w:space="0" w:color="000000"/>
               <w:left w:val="single" w:sz="4" w:space="0" w:color="000000"/>
@@ -30011,7 +29994,7 @@
         </w:tc>
         <w:tc>
           <w:tcPr>
-            <w:tcW w:w="1211" w:type="dxa"/>
+            <w:tcW w:w="1214" w:type="dxa"/>
             <w:tcBorders>
               <w:top w:val="single" w:sz="4" w:space="0" w:color="000000"/>
               <w:left w:val="single" w:sz="4" w:space="0" w:color="000000"/>
@@ -30072,7 +30055,7 @@
         </w:tc>
         <w:tc>
           <w:tcPr>
-            <w:tcW w:w="1347" w:type="dxa"/>
+            <w:tcW w:w="1346" w:type="dxa"/>
             <w:tcBorders>
               <w:top w:val="single" w:sz="4" w:space="0" w:color="000000"/>
               <w:left w:val="single" w:sz="4" w:space="0" w:color="000000"/>
@@ -30133,7 +30116,7 @@
         </w:tc>
         <w:tc>
           <w:tcPr>
-            <w:tcW w:w="1342" w:type="dxa"/>
+            <w:tcW w:w="1340" w:type="dxa"/>
             <w:tcBorders>
               <w:top w:val="single" w:sz="4" w:space="0" w:color="000000"/>
               <w:left w:val="single" w:sz="4" w:space="0" w:color="000000"/>
@@ -30504,7 +30487,7 @@
         </w:tc>
         <w:tc>
           <w:tcPr>
-            <w:tcW w:w="1211" w:type="dxa"/>
+            <w:tcW w:w="1214" w:type="dxa"/>
             <w:tcBorders>
               <w:top w:val="single" w:sz="4" w:space="0" w:color="000000"/>
               <w:left w:val="single" w:sz="4" w:space="0" w:color="000000"/>
@@ -30565,7 +30548,7 @@
         </w:tc>
         <w:tc>
           <w:tcPr>
-            <w:tcW w:w="1347" w:type="dxa"/>
+            <w:tcW w:w="1346" w:type="dxa"/>
             <w:tcBorders>
               <w:top w:val="single" w:sz="4" w:space="0" w:color="000000"/>
               <w:left w:val="single" w:sz="4" w:space="0" w:color="000000"/>
@@ -30626,7 +30609,7 @@
         </w:tc>
         <w:tc>
           <w:tcPr>
-            <w:tcW w:w="1342" w:type="dxa"/>
+            <w:tcW w:w="1340" w:type="dxa"/>
             <w:tcBorders>
               <w:top w:val="single" w:sz="4" w:space="0" w:color="000000"/>
               <w:left w:val="single" w:sz="4" w:space="0" w:color="000000"/>
@@ -30997,7 +30980,7 @@
         </w:tc>
         <w:tc>
           <w:tcPr>
-            <w:tcW w:w="1211" w:type="dxa"/>
+            <w:tcW w:w="1214" w:type="dxa"/>
             <w:tcBorders>
               <w:top w:val="single" w:sz="4" w:space="0" w:color="000000"/>
               <w:left w:val="single" w:sz="4" w:space="0" w:color="000000"/>
@@ -31058,7 +31041,7 @@
         </w:tc>
         <w:tc>
           <w:tcPr>
-            <w:tcW w:w="1347" w:type="dxa"/>
+            <w:tcW w:w="1346" w:type="dxa"/>
             <w:tcBorders>
               <w:top w:val="single" w:sz="4" w:space="0" w:color="000000"/>
               <w:left w:val="single" w:sz="4" w:space="0" w:color="000000"/>
@@ -31119,7 +31102,7 @@
         </w:tc>
         <w:tc>
           <w:tcPr>
-            <w:tcW w:w="1342" w:type="dxa"/>
+            <w:tcW w:w="1340" w:type="dxa"/>
             <w:tcBorders>
               <w:top w:val="single" w:sz="4" w:space="0" w:color="000000"/>
               <w:left w:val="single" w:sz="4" w:space="0" w:color="000000"/>
@@ -31490,7 +31473,7 @@
         </w:tc>
         <w:tc>
           <w:tcPr>
-            <w:tcW w:w="1211" w:type="dxa"/>
+            <w:tcW w:w="1214" w:type="dxa"/>
             <w:tcBorders>
               <w:top w:val="single" w:sz="4" w:space="0" w:color="000000"/>
               <w:left w:val="single" w:sz="4" w:space="0" w:color="000000"/>
@@ -31551,7 +31534,7 @@
         </w:tc>
         <w:tc>
           <w:tcPr>
-            <w:tcW w:w="1347" w:type="dxa"/>
+            <w:tcW w:w="1346" w:type="dxa"/>
             <w:tcBorders>
               <w:top w:val="single" w:sz="4" w:space="0" w:color="000000"/>
               <w:left w:val="single" w:sz="4" w:space="0" w:color="000000"/>
@@ -31612,7 +31595,7 @@
         </w:tc>
         <w:tc>
           <w:tcPr>
-            <w:tcW w:w="1342" w:type="dxa"/>
+            <w:tcW w:w="1340" w:type="dxa"/>
             <w:tcBorders>
               <w:top w:val="single" w:sz="4" w:space="0" w:color="000000"/>
               <w:left w:val="single" w:sz="4" w:space="0" w:color="000000"/>
@@ -35791,7 +35774,7 @@
     </w:r>
     <w:r>
       <w:rPr/>
-      <w:t>14</w:t>
+      <w:t>11</w:t>
     </w:r>
     <w:r>
       <w:rPr/>

</xml_diff>